<commit_message>
feat(report): capitalise molecule names in figure titles and labels
Client review: molecule names read lowercase in the figures. Add a
display_name helper (upper-cases the first letter, preserves a leading locant
and all interior casing — 'quercetin' -> 'Quercetin', '5-phenyltetrazole' ->
'5-Phenyltetrazole') and apply it everywhere a name is shown to a reader:

- figures.py: structure-grid legends (fig1), and the molecule axis labels on
  the FMO diagram (fig2), descriptor comparison (fig3), protonation effect
  (fig3b), and geometry comparison. Data lookups keep the raw name; only the
  displayed label is capitalised.
- make_figures.py: the orbital (fig2b), Fukui (fig4), and ESP (fig7) titles.

Re-rendered every name-bearing figure across all cases and the six report
bundles; the pose/energy/RDF figures carry no name and are unchanged. 3 new
tests for display_name.

Co-Authored-By: Claude Opus 4.8 <noreply@anthropic.com>
</commit_message>
<xml_diff>
--- a/cases/phytic-acid/report/report.docx
+++ b/cases/phytic-acid/report/report.docx
@@ -16,7 +16,7 @@
           <w:b w:val="0"/>
           <w:color w:val="718096"/>
         </w:rPr>
-        <w:t>Substrate: Fe(110)  |  Medium: 0.5 M H2SO4  |  DFT level: B3LYP/6-31G(d) (ddCOSMO:water)  |  Generated 2026-07-14 17:08</w:t>
+        <w:t>Substrate: Fe(110)  |  Medium: 0.5 M H2SO4  |  DFT level: B3LYP/6-31G(d) (ddCOSMO:water)  |  Generated 2026-07-14 17:39</w:t>
       </w:r>
     </w:p>
     <w:p>
@@ -478,7 +478,7 @@
       <w:r>
         <w:drawing>
           <wp:inline xmlns:a="http://schemas.openxmlformats.org/drawingml/2006/main" xmlns:pic="http://schemas.openxmlformats.org/drawingml/2006/picture">
-            <wp:extent cx="5212080" cy="8683007"/>
+            <wp:extent cx="5212080" cy="8694387"/>
             <wp:docPr id="3" name="Picture 3"/>
             <wp:cNvGraphicFramePr>
               <a:graphicFrameLocks noChangeAspect="1"/>
@@ -499,7 +499,7 @@
                   <pic:spPr>
                     <a:xfrm>
                       <a:off x="0" y="0"/>
-                      <a:ext cx="5212080" cy="8683007"/>
+                      <a:ext cx="5212080" cy="8694387"/>
                     </a:xfrm>
                     <a:prstGeom prst="rect"/>
                   </pic:spPr>
@@ -642,7 +642,7 @@
       <w:r>
         <w:drawing>
           <wp:inline xmlns:a="http://schemas.openxmlformats.org/drawingml/2006/main" xmlns:pic="http://schemas.openxmlformats.org/drawingml/2006/picture">
-            <wp:extent cx="5212080" cy="1466336"/>
+            <wp:extent cx="5212080" cy="1463532"/>
             <wp:docPr id="6" name="Picture 6"/>
             <wp:cNvGraphicFramePr>
               <a:graphicFrameLocks noChangeAspect="1"/>
@@ -663,7 +663,7 @@
                   <pic:spPr>
                     <a:xfrm>
                       <a:off x="0" y="0"/>
-                      <a:ext cx="5212080" cy="1466336"/>
+                      <a:ext cx="5212080" cy="1463532"/>
                     </a:xfrm>
                     <a:prstGeom prst="rect"/>
                   </pic:spPr>
@@ -694,7 +694,7 @@
       <w:r>
         <w:drawing>
           <wp:inline xmlns:a="http://schemas.openxmlformats.org/drawingml/2006/main" xmlns:pic="http://schemas.openxmlformats.org/drawingml/2006/picture">
-            <wp:extent cx="5212080" cy="2093290"/>
+            <wp:extent cx="5212080" cy="2096814"/>
             <wp:docPr id="7" name="Picture 7"/>
             <wp:cNvGraphicFramePr>
               <a:graphicFrameLocks noChangeAspect="1"/>
@@ -715,7 +715,7 @@
                   <pic:spPr>
                     <a:xfrm>
                       <a:off x="0" y="0"/>
-                      <a:ext cx="5212080" cy="2093290"/>
+                      <a:ext cx="5212080" cy="2096814"/>
                     </a:xfrm>
                     <a:prstGeom prst="rect"/>
                   </pic:spPr>

</xml_diff>

<commit_message>
feat(qm): dipole descriptor for the 5 validation cases + SCF density checkpoint (#273)
Backfill the neutral-only dipole_debye descriptor into the five non-arghel case
studies and regenerate their report bundles (report-only; no figure churn). Add
the optional run_pyscf(chkfile=...) that persists the converged wavefunction so
a later density-derived property reloads it instead of repeating the SCF.
Cations left blank (dipole is origin-dependent for an ion). ADR 0031
(neutral-only dipole) and ADR 0032 (density checkpoint).

Co-Authored-By: Claude Opus 4.8 <noreply@anthropic.com>
</commit_message>
<xml_diff>
--- a/cases/phytic-acid/report/report.docx
+++ b/cases/phytic-acid/report/report.docx
@@ -16,7 +16,7 @@
           <w:b w:val="0"/>
           <w:color w:val="718096"/>
         </w:rPr>
-        <w:t>Substrate: Fe(110)  |  Medium: 0.5 M H2SO4  |  DFT level: B3LYP/6-31G(d) (ddCOSMO:water)  |  Generated 2026-07-14 18:07</w:t>
+        <w:t>Substrate: Fe(110)  |  Medium: 0.5 M H2SO4  |  DFT level: B3LYP/6-31G(d) (ddCOSMO:water)  |  Generated 2026-07-18 08:12</w:t>
       </w:r>
     </w:p>
     <w:p>
@@ -1098,6 +1098,36 @@
                 <w:b w:val="0"/>
                 <w:sz w:val="17"/>
               </w:rPr>
+              <w:t>Dipole (D)</w:t>
+            </w:r>
+          </w:p>
+        </w:tc>
+        <w:tc>
+          <w:tcPr>
+            <w:tcW w:type="dxa" w:w="4320"/>
+          </w:tcPr>
+          <w:p>
+            <w:r>
+              <w:rPr>
+                <w:b w:val="0"/>
+                <w:sz w:val="17"/>
+              </w:rPr>
+              <w:t>7.257</w:t>
+            </w:r>
+          </w:p>
+        </w:tc>
+      </w:tr>
+      <w:tr>
+        <w:tc>
+          <w:tcPr>
+            <w:tcW w:type="dxa" w:w="4320"/>
+          </w:tcPr>
+          <w:p>
+            <w:r>
+              <w:rPr>
+                <w:b w:val="0"/>
+                <w:sz w:val="17"/>
+              </w:rPr>
               <w:t>TNC</w:t>
             </w:r>
           </w:p>

</xml_diff>

<commit_message>
feat(qm): dipole descriptor for the 5 validation cases + SCF density checkpoint (#273) (#275)
Backfill the neutral-only dipole_debye descriptor into the five non-arghel case
studies and regenerate their report bundles (report-only; no figure churn). Add
the optional run_pyscf(chkfile=...) that persists the converged wavefunction so
a later density-derived property reloads it instead of repeating the SCF.
Cations left blank (dipole is origin-dependent for an ion). ADR 0031
(neutral-only dipole) and ADR 0032 (density checkpoint).

Co-authored-by: Claude Opus 4.8 <noreply@anthropic.com>
</commit_message>
<xml_diff>
--- a/cases/phytic-acid/report/report.docx
+++ b/cases/phytic-acid/report/report.docx
@@ -16,7 +16,7 @@
           <w:b w:val="0"/>
           <w:color w:val="718096"/>
         </w:rPr>
-        <w:t>Substrate: Fe(110)  |  Medium: 0.5 M H2SO4  |  DFT level: B3LYP/6-31G(d) (ddCOSMO:water)  |  Generated 2026-07-14 18:07</w:t>
+        <w:t>Substrate: Fe(110)  |  Medium: 0.5 M H2SO4  |  DFT level: B3LYP/6-31G(d) (ddCOSMO:water)  |  Generated 2026-07-18 08:12</w:t>
       </w:r>
     </w:p>
     <w:p>
@@ -1098,6 +1098,36 @@
                 <w:b w:val="0"/>
                 <w:sz w:val="17"/>
               </w:rPr>
+              <w:t>Dipole (D)</w:t>
+            </w:r>
+          </w:p>
+        </w:tc>
+        <w:tc>
+          <w:tcPr>
+            <w:tcW w:type="dxa" w:w="4320"/>
+          </w:tcPr>
+          <w:p>
+            <w:r>
+              <w:rPr>
+                <w:b w:val="0"/>
+                <w:sz w:val="17"/>
+              </w:rPr>
+              <w:t>7.257</w:t>
+            </w:r>
+          </w:p>
+        </w:tc>
+      </w:tr>
+      <w:tr>
+        <w:tc>
+          <w:tcPr>
+            <w:tcW w:type="dxa" w:w="4320"/>
+          </w:tcPr>
+          <w:p>
+            <w:r>
+              <w:rPr>
+                <w:b w:val="0"/>
+                <w:sz w:val="17"/>
+              </w:rPr>
               <w:t>TNC</w:t>
             </w:r>
           </w:p>

</xml_diff>